<commit_message>
Yassine Cherqi : ajout du vendredi 20h30-22h
Le cours "Adultes" du vendredi 20h30-22h lui est desormais assigne dans
iClub. Son vendredi collectif passe de 17h30-20h30 a 17h30-22h et son
total hebdomadaire de 32h30 a 34h. Aucun autre prof n'est affecte.

Co-Authored-By: Claude Opus 5 <noreply@anthropic.com>
Claude-Session: https://claude.ai/code/session_01CP9eZ8ypAHjVkDVd1FLqef
</commit_message>
<xml_diff>
--- a/Horaires profs 2026-2027/Horaire - Yassine Cherqi.docx
+++ b/Horaires profs 2026-2027/Horaire - Yassine Cherqi.docx
@@ -58,7 +58,7 @@
           <w:sz w:val="24"/>
           <w:szCs w:val="24"/>
         </w:rPr>
-        <w:t xml:space="preserve">	23h30</w:t>
+        <w:t xml:space="preserve">	25h</w:t>
       </w:r>
     </w:p>
     <w:tbl>
@@ -363,7 +363,7 @@
                 <w:sz w:val="22"/>
                 <w:szCs w:val="22"/>
               </w:rPr>
-              <w:t xml:space="preserve">de 12h30 à 14h, de 17h30 à 20h30</w:t>
+              <w:t xml:space="preserve">de 12h30 à 14h, de 17h30 à 22h</w:t>
             </w:r>
           </w:p>
         </w:tc>
@@ -847,7 +847,7 @@
           <w:sz w:val="30"/>
           <w:szCs w:val="30"/>
         </w:rPr>
-        <w:t xml:space="preserve">	32h30</w:t>
+        <w:t xml:space="preserve">	34h</w:t>
       </w:r>
     </w:p>
     <w:sectPr>

</xml_diff>

<commit_message>
Ajout d'un recapitulatif par jour en tete de document (Yassine Cherqi)
Nouveau premier tableau reprenant l'ensemble des cours par jour, sans
distinction collectif/prive, avant les deux tableaux existants. Les
plages y sont fusionnees a travers les deux categories : un cours prive
suivi d'un collectif apparait comme une seule plage continue.

Applique pour l'instant au seul document de Yassine Cherqi, en attente
de validation avant generalisation aux 21 autres profs.

Co-Authored-By: Claude Opus 5 <noreply@anthropic.com>
Claude-Session: https://claude.ai/code/session_01CP9eZ8ypAHjVkDVd1FLqef
</commit_message>
<xml_diff>
--- a/Horaires profs 2026-2027/Horaire - Yassine Cherqi.docx
+++ b/Horaires profs 2026-2027/Horaire - Yassine Cherqi.docx
@@ -33,6 +33,389 @@
         <w:t xml:space="preserve">Horaires — Cycle annuel 2026-2027</w:t>
       </w:r>
     </w:p>
+    <w:p>
+      <w:pPr>
+        <w:tabs>
+          <w:tab w:val="right" w:pos="9026"/>
+        </w:tabs>
+        <w:spacing w:after="140" w:before="320"/>
+      </w:pPr>
+      <w:r>
+        <w:rPr>
+          <w:b/>
+          <w:bCs/>
+          <w:color w:val="1F3864"/>
+          <w:sz w:val="26"/>
+          <w:szCs w:val="26"/>
+        </w:rPr>
+        <w:t xml:space="preserve">Récapitulatif par jour</w:t>
+      </w:r>
+    </w:p>
+    <w:tbl>
+      <w:tblPr>
+        <w:tblW w:type="dxa" w:w="9026"/>
+        <w:tblBorders>
+          <w:top w:val="single" w:color="auto" w:sz="4"/>
+          <w:left w:val="single" w:color="auto" w:sz="4"/>
+          <w:bottom w:val="single" w:color="auto" w:sz="4"/>
+          <w:right w:val="single" w:color="auto" w:sz="4"/>
+          <w:insideH w:val="single" w:color="auto" w:sz="4"/>
+          <w:insideV w:val="single" w:color="auto" w:sz="4"/>
+        </w:tblBorders>
+      </w:tblPr>
+      <w:tblGrid>
+        <w:gridCol w:w="2400"/>
+        <w:gridCol w:w="6626"/>
+      </w:tblGrid>
+      <w:tr>
+        <w:tc>
+          <w:tcPr>
+            <w:tcW w:type="dxa" w:w="2400"/>
+            <w:tcBorders>
+              <w:top w:val="none" w:color="FFFFFF" w:sz="0"/>
+              <w:left w:val="none" w:color="FFFFFF" w:sz="0"/>
+              <w:bottom w:val="single" w:color="BFBFBF" w:sz="4"/>
+              <w:right w:val="none" w:color="FFFFFF" w:sz="0"/>
+            </w:tcBorders>
+            <w:shd w:fill="F2F5FA" w:color="auto" w:val="clear"/>
+            <w:tcMar>
+              <w:top w:type="dxa" w:w="110"/>
+              <w:left w:type="dxa" w:w="140"/>
+              <w:bottom w:type="dxa" w:w="110"/>
+              <w:right w:type="dxa" w:w="140"/>
+            </w:tcMar>
+          </w:tcPr>
+          <w:p>
+            <w:r>
+              <w:rPr>
+                <w:b/>
+                <w:bCs/>
+                <w:color w:val="1F3864"/>
+                <w:sz w:val="22"/>
+                <w:szCs w:val="22"/>
+              </w:rPr>
+              <w:t xml:space="preserve">Lundi</w:t>
+            </w:r>
+          </w:p>
+        </w:tc>
+        <w:tc>
+          <w:tcPr>
+            <w:tcW w:type="dxa" w:w="6626"/>
+            <w:tcBorders>
+              <w:top w:val="none" w:color="FFFFFF" w:sz="0"/>
+              <w:left w:val="none" w:color="FFFFFF" w:sz="0"/>
+              <w:bottom w:val="single" w:color="BFBFBF" w:sz="4"/>
+              <w:right w:val="none" w:color="FFFFFF" w:sz="0"/>
+            </w:tcBorders>
+            <w:shd w:fill="F2F5FA" w:color="auto" w:val="clear"/>
+            <w:tcMar>
+              <w:top w:type="dxa" w:w="110"/>
+              <w:left w:type="dxa" w:w="140"/>
+              <w:bottom w:type="dxa" w:w="110"/>
+              <w:right w:type="dxa" w:w="140"/>
+            </w:tcMar>
+          </w:tcPr>
+          <w:p>
+            <w:r>
+              <w:rPr>
+                <w:sz w:val="22"/>
+                <w:szCs w:val="22"/>
+              </w:rPr>
+              <w:t xml:space="preserve">de 12h30 à 14h, de 16h à 18h, de 18h30 à 21h30</w:t>
+            </w:r>
+          </w:p>
+        </w:tc>
+      </w:tr>
+      <w:tr>
+        <w:tc>
+          <w:tcPr>
+            <w:tcW w:type="dxa" w:w="2400"/>
+            <w:tcBorders>
+              <w:top w:val="none" w:color="FFFFFF" w:sz="0"/>
+              <w:left w:val="none" w:color="FFFFFF" w:sz="0"/>
+              <w:bottom w:val="single" w:color="BFBFBF" w:sz="4"/>
+              <w:right w:val="none" w:color="FFFFFF" w:sz="0"/>
+            </w:tcBorders>
+            <w:tcMar>
+              <w:top w:type="dxa" w:w="110"/>
+              <w:left w:type="dxa" w:w="140"/>
+              <w:bottom w:type="dxa" w:w="110"/>
+              <w:right w:type="dxa" w:w="140"/>
+            </w:tcMar>
+          </w:tcPr>
+          <w:p>
+            <w:r>
+              <w:rPr>
+                <w:b/>
+                <w:bCs/>
+                <w:color w:val="1F3864"/>
+                <w:sz w:val="22"/>
+                <w:szCs w:val="22"/>
+              </w:rPr>
+              <w:t xml:space="preserve">Mardi</w:t>
+            </w:r>
+          </w:p>
+        </w:tc>
+        <w:tc>
+          <w:tcPr>
+            <w:tcW w:type="dxa" w:w="6626"/>
+            <w:tcBorders>
+              <w:top w:val="none" w:color="FFFFFF" w:sz="0"/>
+              <w:left w:val="none" w:color="FFFFFF" w:sz="0"/>
+              <w:bottom w:val="single" w:color="BFBFBF" w:sz="4"/>
+              <w:right w:val="none" w:color="FFFFFF" w:sz="0"/>
+            </w:tcBorders>
+            <w:tcMar>
+              <w:top w:type="dxa" w:w="110"/>
+              <w:left w:type="dxa" w:w="140"/>
+              <w:bottom w:type="dxa" w:w="110"/>
+              <w:right w:type="dxa" w:w="140"/>
+            </w:tcMar>
+          </w:tcPr>
+          <w:p>
+            <w:r>
+              <w:rPr>
+                <w:sz w:val="22"/>
+                <w:szCs w:val="22"/>
+              </w:rPr>
+              <w:t xml:space="preserve">de 15h30 à 22h</w:t>
+            </w:r>
+          </w:p>
+        </w:tc>
+      </w:tr>
+      <w:tr>
+        <w:tc>
+          <w:tcPr>
+            <w:tcW w:type="dxa" w:w="2400"/>
+            <w:tcBorders>
+              <w:top w:val="none" w:color="FFFFFF" w:sz="0"/>
+              <w:left w:val="none" w:color="FFFFFF" w:sz="0"/>
+              <w:bottom w:val="single" w:color="BFBFBF" w:sz="4"/>
+              <w:right w:val="none" w:color="FFFFFF" w:sz="0"/>
+            </w:tcBorders>
+            <w:shd w:fill="F2F5FA" w:color="auto" w:val="clear"/>
+            <w:tcMar>
+              <w:top w:type="dxa" w:w="110"/>
+              <w:left w:type="dxa" w:w="140"/>
+              <w:bottom w:type="dxa" w:w="110"/>
+              <w:right w:type="dxa" w:w="140"/>
+            </w:tcMar>
+          </w:tcPr>
+          <w:p>
+            <w:r>
+              <w:rPr>
+                <w:b/>
+                <w:bCs/>
+                <w:color w:val="1F3864"/>
+                <w:sz w:val="22"/>
+                <w:szCs w:val="22"/>
+              </w:rPr>
+              <w:t xml:space="preserve">Mercredi</w:t>
+            </w:r>
+          </w:p>
+        </w:tc>
+        <w:tc>
+          <w:tcPr>
+            <w:tcW w:type="dxa" w:w="6626"/>
+            <w:tcBorders>
+              <w:top w:val="none" w:color="FFFFFF" w:sz="0"/>
+              <w:left w:val="none" w:color="FFFFFF" w:sz="0"/>
+              <w:bottom w:val="single" w:color="BFBFBF" w:sz="4"/>
+              <w:right w:val="none" w:color="FFFFFF" w:sz="0"/>
+            </w:tcBorders>
+            <w:shd w:fill="F2F5FA" w:color="auto" w:val="clear"/>
+            <w:tcMar>
+              <w:top w:type="dxa" w:w="110"/>
+              <w:left w:type="dxa" w:w="140"/>
+              <w:bottom w:type="dxa" w:w="110"/>
+              <w:right w:type="dxa" w:w="140"/>
+            </w:tcMar>
+          </w:tcPr>
+          <w:p>
+            <w:r>
+              <w:rPr>
+                <w:sz w:val="22"/>
+                <w:szCs w:val="22"/>
+              </w:rPr>
+              <w:t xml:space="preserve">de 13h à 16h, de 17h30 à 21h</w:t>
+            </w:r>
+          </w:p>
+        </w:tc>
+      </w:tr>
+      <w:tr>
+        <w:tc>
+          <w:tcPr>
+            <w:tcW w:type="dxa" w:w="2400"/>
+            <w:tcBorders>
+              <w:top w:val="none" w:color="FFFFFF" w:sz="0"/>
+              <w:left w:val="none" w:color="FFFFFF" w:sz="0"/>
+              <w:bottom w:val="single" w:color="BFBFBF" w:sz="4"/>
+              <w:right w:val="none" w:color="FFFFFF" w:sz="0"/>
+            </w:tcBorders>
+            <w:tcMar>
+              <w:top w:type="dxa" w:w="110"/>
+              <w:left w:type="dxa" w:w="140"/>
+              <w:bottom w:type="dxa" w:w="110"/>
+              <w:right w:type="dxa" w:w="140"/>
+            </w:tcMar>
+          </w:tcPr>
+          <w:p>
+            <w:r>
+              <w:rPr>
+                <w:b/>
+                <w:bCs/>
+                <w:color w:val="1F3864"/>
+                <w:sz w:val="22"/>
+                <w:szCs w:val="22"/>
+              </w:rPr>
+              <w:t xml:space="preserve">Jeudi</w:t>
+            </w:r>
+          </w:p>
+        </w:tc>
+        <w:tc>
+          <w:tcPr>
+            <w:tcW w:type="dxa" w:w="6626"/>
+            <w:tcBorders>
+              <w:top w:val="none" w:color="FFFFFF" w:sz="0"/>
+              <w:left w:val="none" w:color="FFFFFF" w:sz="0"/>
+              <w:bottom w:val="single" w:color="BFBFBF" w:sz="4"/>
+              <w:right w:val="none" w:color="FFFFFF" w:sz="0"/>
+            </w:tcBorders>
+            <w:tcMar>
+              <w:top w:type="dxa" w:w="110"/>
+              <w:left w:type="dxa" w:w="140"/>
+              <w:bottom w:type="dxa" w:w="110"/>
+              <w:right w:type="dxa" w:w="140"/>
+            </w:tcMar>
+          </w:tcPr>
+          <w:p>
+            <w:r>
+              <w:rPr>
+                <w:sz w:val="22"/>
+                <w:szCs w:val="22"/>
+              </w:rPr>
+              <w:t xml:space="preserve">de 16h à 20h</w:t>
+            </w:r>
+          </w:p>
+        </w:tc>
+      </w:tr>
+      <w:tr>
+        <w:tc>
+          <w:tcPr>
+            <w:tcW w:type="dxa" w:w="2400"/>
+            <w:tcBorders>
+              <w:top w:val="none" w:color="FFFFFF" w:sz="0"/>
+              <w:left w:val="none" w:color="FFFFFF" w:sz="0"/>
+              <w:bottom w:val="single" w:color="BFBFBF" w:sz="4"/>
+              <w:right w:val="none" w:color="FFFFFF" w:sz="0"/>
+            </w:tcBorders>
+            <w:shd w:fill="F2F5FA" w:color="auto" w:val="clear"/>
+            <w:tcMar>
+              <w:top w:type="dxa" w:w="110"/>
+              <w:left w:type="dxa" w:w="140"/>
+              <w:bottom w:type="dxa" w:w="110"/>
+              <w:right w:type="dxa" w:w="140"/>
+            </w:tcMar>
+          </w:tcPr>
+          <w:p>
+            <w:r>
+              <w:rPr>
+                <w:b/>
+                <w:bCs/>
+                <w:color w:val="1F3864"/>
+                <w:sz w:val="22"/>
+                <w:szCs w:val="22"/>
+              </w:rPr>
+              <w:t xml:space="preserve">Vendredi</w:t>
+            </w:r>
+          </w:p>
+        </w:tc>
+        <w:tc>
+          <w:tcPr>
+            <w:tcW w:type="dxa" w:w="6626"/>
+            <w:tcBorders>
+              <w:top w:val="none" w:color="FFFFFF" w:sz="0"/>
+              <w:left w:val="none" w:color="FFFFFF" w:sz="0"/>
+              <w:bottom w:val="single" w:color="BFBFBF" w:sz="4"/>
+              <w:right w:val="none" w:color="FFFFFF" w:sz="0"/>
+            </w:tcBorders>
+            <w:shd w:fill="F2F5FA" w:color="auto" w:val="clear"/>
+            <w:tcMar>
+              <w:top w:type="dxa" w:w="110"/>
+              <w:left w:type="dxa" w:w="140"/>
+              <w:bottom w:type="dxa" w:w="110"/>
+              <w:right w:type="dxa" w:w="140"/>
+            </w:tcMar>
+          </w:tcPr>
+          <w:p>
+            <w:r>
+              <w:rPr>
+                <w:sz w:val="22"/>
+                <w:szCs w:val="22"/>
+              </w:rPr>
+              <w:t xml:space="preserve">de 12h30 à 14h, de 15h à 17h, de 17h30 à 22h</w:t>
+            </w:r>
+          </w:p>
+        </w:tc>
+      </w:tr>
+      <w:tr>
+        <w:tc>
+          <w:tcPr>
+            <w:tcW w:type="dxa" w:w="2400"/>
+            <w:tcBorders>
+              <w:top w:val="none" w:color="FFFFFF" w:sz="0"/>
+              <w:left w:val="none" w:color="FFFFFF" w:sz="0"/>
+              <w:bottom w:val="single" w:color="BFBFBF" w:sz="4"/>
+              <w:right w:val="none" w:color="FFFFFF" w:sz="0"/>
+            </w:tcBorders>
+            <w:tcMar>
+              <w:top w:type="dxa" w:w="110"/>
+              <w:left w:type="dxa" w:w="140"/>
+              <w:bottom w:type="dxa" w:w="110"/>
+              <w:right w:type="dxa" w:w="140"/>
+            </w:tcMar>
+          </w:tcPr>
+          <w:p>
+            <w:r>
+              <w:rPr>
+                <w:b/>
+                <w:bCs/>
+                <w:color w:val="1F3864"/>
+                <w:sz w:val="22"/>
+                <w:szCs w:val="22"/>
+              </w:rPr>
+              <w:t xml:space="preserve">Samedi</w:t>
+            </w:r>
+          </w:p>
+        </w:tc>
+        <w:tc>
+          <w:tcPr>
+            <w:tcW w:type="dxa" w:w="6626"/>
+            <w:tcBorders>
+              <w:top w:val="none" w:color="FFFFFF" w:sz="0"/>
+              <w:left w:val="none" w:color="FFFFFF" w:sz="0"/>
+              <w:bottom w:val="single" w:color="BFBFBF" w:sz="4"/>
+              <w:right w:val="none" w:color="FFFFFF" w:sz="0"/>
+            </w:tcBorders>
+            <w:tcMar>
+              <w:top w:type="dxa" w:w="110"/>
+              <w:left w:type="dxa" w:w="140"/>
+              <w:bottom w:type="dxa" w:w="110"/>
+              <w:right w:type="dxa" w:w="140"/>
+            </w:tcMar>
+          </w:tcPr>
+          <w:p>
+            <w:r>
+              <w:rPr>
+                <w:sz w:val="22"/>
+                <w:szCs w:val="22"/>
+              </w:rPr>
+              <w:t xml:space="preserve">de 12h à 13h, de 13h30 à 15h</w:t>
+            </w:r>
+          </w:p>
+        </w:tc>
+      </w:tr>
+    </w:tbl>
     <w:p>
       <w:pPr>
         <w:tabs>

</xml_diff>